<commit_message>
Figures: plain matplotlib style; legends and labels placed off the data; overlap check before every save
report/plotstyle.py: matplotlib defaults (full frame, no grid, framed
legend), legend placement that avoids every data mark, point-label
placement, and a check that fails the build when a legend or label covers
data, another label, or a neighbouring panel. All 19 paper figures pass.
Matched-budget figures use dotted lines instead of arrows (captions
updated). Test fixtures follow the new figure code; the old-PDF number
test whitelists four axis tick labels that the restyle no longer prints.

Co-Authored-By: Claude Opus 5.5 <noreply@anthropic.com>
Claude-Session: https://claude.ai/code/session_01AZKuaGMjTScepPgwFXtqVa
</commit_message>
<xml_diff>
--- a/paper/two_backbones/KernelRoute_paper.docx
+++ b/paper/two_backbones/KernelRoute_paper.docx
@@ -7057,7 +7057,7 @@
       <w:r>
         <w:drawing>
           <wp:inline>
-            <wp:extent cx="5334000" cy="2194759"/>
+            <wp:extent cx="5334000" cy="1815976"/>
             <wp:effectExtent b="0" l="0" r="0" t="0"/>
             <wp:docPr descr="" title="" id="33" name="Picture"/>
             <a:graphic>
@@ -7078,7 +7078,7 @@
                   <pic:spPr bwMode="auto">
                     <a:xfrm>
                       <a:off x="0" y="0"/>
-                      <a:ext cx="5334000" cy="2194759"/>
+                      <a:ext cx="5334000" cy="1815976"/>
                     </a:xfrm>
                     <a:prstGeom prst="rect">
                       <a:avLst/>
@@ -10222,7 +10222,7 @@
       <w:r>
         <w:drawing>
           <wp:inline>
-            <wp:extent cx="5334000" cy="2421076"/>
+            <wp:extent cx="5334000" cy="1871514"/>
             <wp:effectExtent b="0" l="0" r="0" t="0"/>
             <wp:docPr descr="" title="" id="36" name="Picture"/>
             <a:graphic>
@@ -10243,7 +10243,7 @@
                   <pic:spPr bwMode="auto">
                     <a:xfrm>
                       <a:off x="0" y="0"/>
-                      <a:ext cx="5334000" cy="2421076"/>
+                      <a:ext cx="5334000" cy="1871514"/>
                     </a:xfrm>
                     <a:prstGeom prst="rect">
                       <a:avLst/>
@@ -10332,7 +10332,7 @@
       <w:r>
         <w:drawing>
           <wp:inline>
-            <wp:extent cx="5334000" cy="2516659"/>
+            <wp:extent cx="5334000" cy="1859153"/>
             <wp:effectExtent b="0" l="0" r="0" t="0"/>
             <wp:docPr descr="" title="" id="40" name="Picture"/>
             <a:graphic>
@@ -10353,7 +10353,7 @@
                   <pic:spPr bwMode="auto">
                     <a:xfrm>
                       <a:off x="0" y="0"/>
-                      <a:ext cx="5334000" cy="2516659"/>
+                      <a:ext cx="5334000" cy="1859153"/>
                     </a:xfrm>
                     <a:prstGeom prst="rect">
                       <a:avLst/>
@@ -11636,7 +11636,7 @@
       <w:r>
         <w:drawing>
           <wp:inline>
-            <wp:extent cx="5334000" cy="2413389"/>
+            <wp:extent cx="5334000" cy="1938966"/>
             <wp:effectExtent b="0" l="0" r="0" t="0"/>
             <wp:docPr descr="" title="" id="43" name="Picture"/>
             <a:graphic>
@@ -11657,7 +11657,7 @@
                   <pic:spPr bwMode="auto">
                     <a:xfrm>
                       <a:off x="0" y="0"/>
-                      <a:ext cx="5334000" cy="2413389"/>
+                      <a:ext cx="5334000" cy="1938966"/>
                     </a:xfrm>
                     <a:prstGeom prst="rect">
                       <a:avLst/>
@@ -12042,7 +12042,7 @@
       <w:r>
         <w:drawing>
           <wp:inline>
-            <wp:extent cx="5334000" cy="2767565"/>
+            <wp:extent cx="5334000" cy="2168059"/>
             <wp:effectExtent b="0" l="0" r="0" t="0"/>
             <wp:docPr descr="" title="" id="49" name="Picture"/>
             <a:graphic>
@@ -12063,7 +12063,7 @@
                   <pic:spPr bwMode="auto">
                     <a:xfrm>
                       <a:off x="0" y="0"/>
-                      <a:ext cx="5334000" cy="2767565"/>
+                      <a:ext cx="5334000" cy="2168059"/>
                     </a:xfrm>
                     <a:prstGeom prst="rect">
                       <a:avLst/>
@@ -17194,7 +17194,7 @@
       <w:r>
         <w:drawing>
           <wp:inline>
-            <wp:extent cx="5334000" cy="2408506"/>
+            <wp:extent cx="5334000" cy="1937958"/>
             <wp:effectExtent b="0" l="0" r="0" t="0"/>
             <wp:docPr descr="" title="" id="57" name="Picture"/>
             <a:graphic>
@@ -17215,7 +17215,7 @@
                   <pic:spPr bwMode="auto">
                     <a:xfrm>
                       <a:off x="0" y="0"/>
-                      <a:ext cx="5334000" cy="2408506"/>
+                      <a:ext cx="5334000" cy="1937958"/>
                     </a:xfrm>
                     <a:prstGeom prst="rect">
                       <a:avLst/>
@@ -18148,7 +18148,7 @@
       <w:r>
         <w:drawing>
           <wp:inline>
-            <wp:extent cx="5334000" cy="1966744"/>
+            <wp:extent cx="5334000" cy="1946235"/>
             <wp:effectExtent b="0" l="0" r="0" t="0"/>
             <wp:docPr descr="" title="" id="61" name="Picture"/>
             <a:graphic>
@@ -18169,7 +18169,7 @@
                   <pic:spPr bwMode="auto">
                     <a:xfrm>
                       <a:off x="0" y="0"/>
-                      <a:ext cx="5334000" cy="1966744"/>
+                      <a:ext cx="5334000" cy="1946235"/>
                     </a:xfrm>
                     <a:prstGeom prst="rect">
                       <a:avLst/>
@@ -26524,7 +26524,7 @@
       <w:r>
         <w:drawing>
           <wp:inline>
-            <wp:extent cx="5334000" cy="2457330"/>
+            <wp:extent cx="5334000" cy="1943995"/>
             <wp:effectExtent b="0" l="0" r="0" t="0"/>
             <wp:docPr descr="" title="" id="72" name="Picture"/>
             <a:graphic>
@@ -26545,7 +26545,7 @@
                   <pic:spPr bwMode="auto">
                     <a:xfrm>
                       <a:off x="0" y="0"/>
-                      <a:ext cx="5334000" cy="2457330"/>
+                      <a:ext cx="5334000" cy="1943995"/>
                     </a:xfrm>
                     <a:prstGeom prst="rect">
                       <a:avLst/>
@@ -26618,7 +26618,7 @@
       <w:r>
         <w:drawing>
           <wp:inline>
-            <wp:extent cx="5334000" cy="2341562"/>
+            <wp:extent cx="5334000" cy="1938966"/>
             <wp:effectExtent b="0" l="0" r="0" t="0"/>
             <wp:docPr descr="" title="" id="75" name="Picture"/>
             <a:graphic>
@@ -26639,7 +26639,7 @@
                   <pic:spPr bwMode="auto">
                     <a:xfrm>
                       <a:off x="0" y="0"/>
-                      <a:ext cx="5334000" cy="2341562"/>
+                      <a:ext cx="5334000" cy="1938966"/>
                     </a:xfrm>
                     <a:prstGeom prst="rect">
                       <a:avLst/>
@@ -28180,7 +28180,7 @@
       <w:r>
         <w:drawing>
           <wp:inline>
-            <wp:extent cx="5334000" cy="2198446"/>
+            <wp:extent cx="5334000" cy="1846238"/>
             <wp:effectExtent b="0" l="0" r="0" t="0"/>
             <wp:docPr descr="" title="" id="80" name="Picture"/>
             <a:graphic>
@@ -28201,7 +28201,7 @@
                   <pic:spPr bwMode="auto">
                     <a:xfrm>
                       <a:off x="0" y="0"/>
-                      <a:ext cx="5334000" cy="2198446"/>
+                      <a:ext cx="5334000" cy="1846238"/>
                     </a:xfrm>
                     <a:prstGeom prst="rect">
                       <a:avLst/>
@@ -31000,7 +31000,7 @@
       <w:r>
         <w:drawing>
           <wp:inline>
-            <wp:extent cx="5334000" cy="2435804"/>
+            <wp:extent cx="5334000" cy="2087858"/>
             <wp:effectExtent b="0" l="0" r="0" t="0"/>
             <wp:docPr descr="" title="" id="84" name="Picture"/>
             <a:graphic>
@@ -31021,7 +31021,7 @@
                   <pic:spPr bwMode="auto">
                     <a:xfrm>
                       <a:off x="0" y="0"/>
-                      <a:ext cx="5334000" cy="2435804"/>
+                      <a:ext cx="5334000" cy="2087858"/>
                     </a:xfrm>
                     <a:prstGeom prst="rect">
                       <a:avLst/>
@@ -31045,7 +31045,7 @@
         <w:pStyle w:val="ImageCaption"/>
       </w:pPr>
       <w:r>
-        <w:t xml:space="preserve">Figure 11: ResNet-18: accuracy against stored parameters. Dotted arrows join routed</w:t>
+        <w:t xml:space="preserve">Figure 11: ResNet-18: accuracy against stored parameters. Dotted lines join routed</w:t>
       </w:r>
       <w:r>
         <w:t xml:space="preserve"> </w:t>
@@ -32604,7 +32604,7 @@
       <w:r>
         <w:drawing>
           <wp:inline>
-            <wp:extent cx="5334000" cy="2406009"/>
+            <wp:extent cx="5334000" cy="2086416"/>
             <wp:effectExtent b="0" l="0" r="0" t="0"/>
             <wp:docPr descr="" title="" id="87" name="Picture"/>
             <a:graphic>
@@ -32625,7 +32625,7 @@
                   <pic:spPr bwMode="auto">
                     <a:xfrm>
                       <a:off x="0" y="0"/>
-                      <a:ext cx="5334000" cy="2406009"/>
+                      <a:ext cx="5334000" cy="2086416"/>
                     </a:xfrm>
                     <a:prstGeom prst="rect">
                       <a:avLst/>
@@ -32649,7 +32649,7 @@
         <w:pStyle w:val="ImageCaption"/>
       </w:pPr>
       <w:r>
-        <w:t xml:space="preserve">Figure 12: MobileNetV2: accuracy against stored parameters. Arrows join</w:t>
+        <w:t xml:space="preserve">Figure 12: MobileNetV2: accuracy against stored parameters. Dotted lines join</w:t>
       </w:r>
       <w:r>
         <w:t xml:space="preserve"> </w:t>
@@ -33616,7 +33616,7 @@
       <w:r>
         <w:drawing>
           <wp:inline>
-            <wp:extent cx="5334000" cy="2221544"/>
+            <wp:extent cx="5334000" cy="1829299"/>
             <wp:effectExtent b="0" l="0" r="0" t="0"/>
             <wp:docPr descr="" title="" id="91" name="Picture"/>
             <a:graphic>
@@ -33637,7 +33637,7 @@
                   <pic:spPr bwMode="auto">
                     <a:xfrm>
                       <a:off x="0" y="0"/>
-                      <a:ext cx="5334000" cy="2221544"/>
+                      <a:ext cx="5334000" cy="1829299"/>
                     </a:xfrm>
                     <a:prstGeom prst="rect">
                       <a:avLst/>
@@ -36117,7 +36117,7 @@
       <w:r>
         <w:drawing>
           <wp:inline>
-            <wp:extent cx="5334000" cy="2179569"/>
+            <wp:extent cx="5334000" cy="2116666"/>
             <wp:effectExtent b="0" l="0" r="0" t="0"/>
             <wp:docPr descr="" title="" id="95" name="Picture"/>
             <a:graphic>
@@ -36138,7 +36138,7 @@
                   <pic:spPr bwMode="auto">
                     <a:xfrm>
                       <a:off x="0" y="0"/>
-                      <a:ext cx="5334000" cy="2179569"/>
+                      <a:ext cx="5334000" cy="2116666"/>
                     </a:xfrm>
                     <a:prstGeom prst="rect">
                       <a:avLst/>
@@ -39574,7 +39574,7 @@
       <w:r>
         <w:drawing>
           <wp:inline>
-            <wp:extent cx="5334000" cy="2457330"/>
+            <wp:extent cx="5334000" cy="1943995"/>
             <wp:effectExtent b="0" l="0" r="0" t="0"/>
             <wp:docPr descr="" title="" id="101" name="Picture"/>
             <a:graphic>
@@ -39595,7 +39595,7 @@
                   <pic:spPr bwMode="auto">
                     <a:xfrm>
                       <a:off x="0" y="0"/>
-                      <a:ext cx="5334000" cy="2457330"/>
+                      <a:ext cx="5334000" cy="1943995"/>
                     </a:xfrm>
                     <a:prstGeom prst="rect">
                       <a:avLst/>
@@ -39676,7 +39676,7 @@
       <w:r>
         <w:drawing>
           <wp:inline>
-            <wp:extent cx="5334000" cy="2506281"/>
+            <wp:extent cx="5334000" cy="2262130"/>
             <wp:effectExtent b="0" l="0" r="0" t="0"/>
             <wp:docPr descr="" title="" id="104" name="Picture"/>
             <a:graphic>
@@ -39697,7 +39697,7 @@
                   <pic:spPr bwMode="auto">
                     <a:xfrm>
                       <a:off x="0" y="0"/>
-                      <a:ext cx="5334000" cy="2506281"/>
+                      <a:ext cx="5334000" cy="2262130"/>
                     </a:xfrm>
                     <a:prstGeom prst="rect">
                       <a:avLst/>
@@ -39803,7 +39803,7 @@
       <w:r>
         <w:drawing>
           <wp:inline>
-            <wp:extent cx="5334000" cy="2487842"/>
+            <wp:extent cx="5334000" cy="1859153"/>
             <wp:effectExtent b="0" l="0" r="0" t="0"/>
             <wp:docPr descr="" title="" id="107" name="Picture"/>
             <a:graphic>
@@ -39824,7 +39824,7 @@
                   <pic:spPr bwMode="auto">
                     <a:xfrm>
                       <a:off x="0" y="0"/>
-                      <a:ext cx="5334000" cy="2487842"/>
+                      <a:ext cx="5334000" cy="1859153"/>
                     </a:xfrm>
                     <a:prstGeom prst="rect">
                       <a:avLst/>
@@ -49417,7 +49417,7 @@
       <w:r>
         <w:drawing>
           <wp:inline>
-            <wp:extent cx="5334000" cy="1700342"/>
+            <wp:extent cx="5334000" cy="1621871"/>
             <wp:effectExtent b="0" l="0" r="0" t="0"/>
             <wp:docPr descr="" title="" id="111" name="Picture"/>
             <a:graphic>
@@ -49438,7 +49438,7 @@
                   <pic:spPr bwMode="auto">
                     <a:xfrm>
                       <a:off x="0" y="0"/>
-                      <a:ext cx="5334000" cy="1700342"/>
+                      <a:ext cx="5334000" cy="1621871"/>
                     </a:xfrm>
                     <a:prstGeom prst="rect">
                       <a:avLst/>
@@ -61201,7 +61201,7 @@
       <w:r>
         <w:drawing>
           <wp:inline>
-            <wp:extent cx="5334000" cy="1694818"/>
+            <wp:extent cx="5334000" cy="1621871"/>
             <wp:effectExtent b="0" l="0" r="0" t="0"/>
             <wp:docPr descr="" title="" id="115" name="Picture"/>
             <a:graphic>
@@ -61222,7 +61222,7 @@
                   <pic:spPr bwMode="auto">
                     <a:xfrm>
                       <a:off x="0" y="0"/>
-                      <a:ext cx="5334000" cy="1694818"/>
+                      <a:ext cx="5334000" cy="1621871"/>
                     </a:xfrm>
                     <a:prstGeom prst="rect">
                       <a:avLst/>

</xml_diff>